<commit_message>
Correct branch name in manual
</commit_message>
<xml_diff>
--- a/doc/Manual for running the ThreeME model for results in paper.docx
+++ b/doc/Manual for running the ThreeME model for results in paper.docx
@@ -16,25 +16,7 @@
           <w:bCs/>
           <w:lang w:val="en-US"/>
         </w:rPr>
-        <w:t xml:space="preserve">Manual for running the </w:t>
-      </w:r>
-      <w:proofErr w:type="spellStart"/>
-      <w:r>
-        <w:rPr>
-          <w:b/>
-          <w:bCs/>
-          <w:lang w:val="en-US"/>
-        </w:rPr>
-        <w:t>ThreeME</w:t>
-      </w:r>
-      <w:proofErr w:type="spellEnd"/>
-      <w:r>
-        <w:rPr>
-          <w:b/>
-          <w:bCs/>
-          <w:lang w:val="en-US"/>
-        </w:rPr>
-        <w:t xml:space="preserve"> model for results in paper “Mitigating Foreign Fossil Fuel Shocks: The Role of Renewable Energy and Industrial Electrification in the Netherlands”</w:t>
+        <w:t>Manual for running the ThreeME model for results in paper “Mitigating Foreign Fossil Fuel Shocks: The Role of Renewable Energy and Industrial Electrification in the Netherlands”</w:t>
       </w:r>
     </w:p>
     <w:p>
@@ -69,21 +51,7 @@
         <w:rPr>
           <w:lang w:val="en-US"/>
         </w:rPr>
-        <w:t xml:space="preserve">Download </w:t>
-      </w:r>
-      <w:proofErr w:type="spellStart"/>
-      <w:r>
-        <w:rPr>
-          <w:lang w:val="en-US"/>
-        </w:rPr>
-        <w:t>Eviews</w:t>
-      </w:r>
-      <w:proofErr w:type="spellEnd"/>
-      <w:r>
-        <w:rPr>
-          <w:lang w:val="en-US"/>
-        </w:rPr>
-        <w:t xml:space="preserve">, and make sure that you have a license. </w:t>
+        <w:t xml:space="preserve">Download Eviews, and make sure that you have a license. </w:t>
       </w:r>
     </w:p>
     <w:p>
@@ -101,21 +69,7 @@
         <w:rPr>
           <w:lang w:val="en-US"/>
         </w:rPr>
-        <w:t xml:space="preserve">Make sure you have a </w:t>
-      </w:r>
-      <w:proofErr w:type="spellStart"/>
-      <w:r>
-        <w:rPr>
-          <w:lang w:val="en-US"/>
-        </w:rPr>
-        <w:t>github</w:t>
-      </w:r>
-      <w:proofErr w:type="spellEnd"/>
-      <w:r>
-        <w:rPr>
-          <w:lang w:val="en-US"/>
-        </w:rPr>
-        <w:t xml:space="preserve"> account and take the model from </w:t>
+        <w:t xml:space="preserve">Make sure you have a github account and take the model from </w:t>
       </w:r>
     </w:p>
     <w:p>
@@ -160,7 +114,7 @@
         <w:rPr>
           <w:lang w:val="en-US"/>
         </w:rPr>
-        <w:t>NLD-gas-price-modelling-ec-modelling-2025</w:t>
+        <w:t>NLD-GAS-PRICE-ECOMOD2025</w:t>
       </w:r>
     </w:p>
     <w:p>
@@ -213,21 +167,7 @@
         <w:rPr>
           <w:lang w:val="en-US"/>
         </w:rPr>
-        <w:t xml:space="preserve">Open software program </w:t>
-      </w:r>
-      <w:proofErr w:type="spellStart"/>
-      <w:r>
-        <w:rPr>
-          <w:lang w:val="en-US"/>
-        </w:rPr>
-        <w:t>Eviews</w:t>
-      </w:r>
-      <w:proofErr w:type="spellEnd"/>
-      <w:r>
-        <w:rPr>
-          <w:lang w:val="en-US"/>
-        </w:rPr>
-        <w:t>.</w:t>
+        <w:t>Open software program Eviews.</w:t>
       </w:r>
     </w:p>
     <w:p>
@@ -245,49 +185,7 @@
         <w:rPr>
           <w:lang w:val="en-US"/>
         </w:rPr>
-        <w:t xml:space="preserve">Open file </w:t>
-      </w:r>
-      <w:proofErr w:type="spellStart"/>
-      <w:r>
-        <w:rPr>
-          <w:lang w:val="en-US"/>
-        </w:rPr>
-        <w:t>scr</w:t>
-      </w:r>
-      <w:proofErr w:type="spellEnd"/>
-      <w:r>
-        <w:rPr>
-          <w:lang w:val="en-US"/>
-        </w:rPr>
-        <w:t>/</w:t>
-      </w:r>
-      <w:proofErr w:type="spellStart"/>
-      <w:r>
-        <w:rPr>
-          <w:lang w:val="en-US"/>
-        </w:rPr>
-        <w:t>Eviews</w:t>
-      </w:r>
-      <w:proofErr w:type="spellEnd"/>
-      <w:r>
-        <w:rPr>
-          <w:lang w:val="en-US"/>
-        </w:rPr>
-        <w:t>/</w:t>
-      </w:r>
-      <w:proofErr w:type="spellStart"/>
-      <w:r>
-        <w:rPr>
-          <w:lang w:val="en-US"/>
-        </w:rPr>
-        <w:t>main.prg</w:t>
-      </w:r>
-      <w:proofErr w:type="spellEnd"/>
-      <w:r>
-        <w:rPr>
-          <w:lang w:val="en-US"/>
-        </w:rPr>
-        <w:t xml:space="preserve">, via File </w:t>
+        <w:t xml:space="preserve">Open file scr/Eviews/main.prg, via File </w:t>
       </w:r>
       <w:r>
         <w:rPr>
@@ -445,21 +343,7 @@
         <w:rPr>
           <w:lang w:val="en-US"/>
         </w:rPr>
-        <w:t xml:space="preserve">This creates a new </w:t>
-      </w:r>
-      <w:proofErr w:type="spellStart"/>
-      <w:r>
-        <w:rPr>
-          <w:lang w:val="en-US"/>
-        </w:rPr>
-        <w:t>workfile</w:t>
-      </w:r>
-      <w:proofErr w:type="spellEnd"/>
-      <w:r>
-        <w:rPr>
-          <w:lang w:val="en-US"/>
-        </w:rPr>
-        <w:t xml:space="preserve"> in which the parameters are calibrated for the baseline. </w:t>
+        <w:t xml:space="preserve">This creates a new workfile in which the parameters are calibrated for the baseline. </w:t>
       </w:r>
     </w:p>
     <w:p>
@@ -508,49 +392,7 @@
         <w:rPr>
           <w:lang w:val="en-US"/>
         </w:rPr>
-        <w:t xml:space="preserve">ile </w:t>
-      </w:r>
-      <w:proofErr w:type="spellStart"/>
-      <w:r>
-        <w:rPr>
-          <w:lang w:val="en-US"/>
-        </w:rPr>
-        <w:t>scr</w:t>
-      </w:r>
-      <w:proofErr w:type="spellEnd"/>
-      <w:r>
-        <w:rPr>
-          <w:lang w:val="en-US"/>
-        </w:rPr>
-        <w:t>/</w:t>
-      </w:r>
-      <w:proofErr w:type="spellStart"/>
-      <w:r>
-        <w:rPr>
-          <w:lang w:val="en-US"/>
-        </w:rPr>
-        <w:t>Eviews</w:t>
-      </w:r>
-      <w:proofErr w:type="spellEnd"/>
-      <w:r>
-        <w:rPr>
-          <w:lang w:val="en-US"/>
-        </w:rPr>
-        <w:t>/</w:t>
-      </w:r>
-      <w:proofErr w:type="spellStart"/>
-      <w:r>
-        <w:rPr>
-          <w:lang w:val="en-US"/>
-        </w:rPr>
-        <w:t>run_extra.prg</w:t>
-      </w:r>
-      <w:proofErr w:type="spellEnd"/>
-      <w:r>
-        <w:rPr>
-          <w:lang w:val="en-US"/>
-        </w:rPr>
-        <w:t xml:space="preserve">, via File </w:t>
+        <w:t xml:space="preserve">ile scr/Eviews/run_extra.prg, via File </w:t>
       </w:r>
       <w:r>
         <w:rPr>
@@ -745,21 +587,7 @@
         <w:rPr>
           <w:lang w:val="en-US"/>
         </w:rPr>
-        <w:t xml:space="preserve">Note that the sheets ‘prices_1’, ‘shadowprice_1’ </w:t>
-      </w:r>
-      <w:proofErr w:type="spellStart"/>
-      <w:r>
-        <w:rPr>
-          <w:lang w:val="en-US"/>
-        </w:rPr>
-        <w:t>etc</w:t>
-      </w:r>
-      <w:proofErr w:type="spellEnd"/>
-      <w:r>
-        <w:rPr>
-          <w:lang w:val="en-US"/>
-        </w:rPr>
-        <w:t xml:space="preserve"> are not uploaded (they are only included as a comment).   </w:t>
+        <w:t xml:space="preserve">Note that the sheets ‘prices_1’, ‘shadowprice_1’ etc are not uploaded (they are only included as a comment).   </w:t>
       </w:r>
     </w:p>
     <w:p>
@@ -796,21 +624,7 @@
           <w:lang w:val="en-US"/>
         </w:rPr>
         <w:lastRenderedPageBreak/>
-        <w:t xml:space="preserve">Make sure you save any changes to </w:t>
-      </w:r>
-      <w:proofErr w:type="spellStart"/>
-      <w:r>
-        <w:rPr>
-          <w:lang w:val="en-US"/>
-        </w:rPr>
-        <w:t>run_extra.prg</w:t>
-      </w:r>
-      <w:proofErr w:type="spellEnd"/>
-      <w:r>
-        <w:rPr>
-          <w:lang w:val="en-US"/>
-        </w:rPr>
-        <w:t xml:space="preserve"> before running the model. </w:t>
+        <w:t xml:space="preserve">Make sure you save any changes to run_extra.prg before running the model. </w:t>
       </w:r>
     </w:p>
     <w:p>
@@ -828,21 +642,7 @@
         <w:rPr>
           <w:lang w:val="en-US"/>
         </w:rPr>
-        <w:t>Run the model by going back to the file ‘</w:t>
-      </w:r>
-      <w:proofErr w:type="spellStart"/>
-      <w:r>
-        <w:rPr>
-          <w:lang w:val="en-US"/>
-        </w:rPr>
-        <w:t>main.prg</w:t>
-      </w:r>
-      <w:proofErr w:type="spellEnd"/>
-      <w:r>
-        <w:rPr>
-          <w:lang w:val="en-US"/>
-        </w:rPr>
-        <w:t xml:space="preserve">’. Make sure that – this time – the line </w:t>
+        <w:t xml:space="preserve">Run the model by going back to the file ‘main.prg’. Make sure that – this time – the line </w:t>
       </w:r>
       <w:r>
         <w:rPr>
@@ -850,14 +650,12 @@
         </w:rPr>
         <w:t>call run("</w:t>
       </w:r>
-      <w:proofErr w:type="spellStart"/>
       <w:r>
         <w:rPr>
           <w:lang w:val="en-US"/>
         </w:rPr>
         <w:t>workfile</w:t>
       </w:r>
-      <w:proofErr w:type="spellEnd"/>
       <w:r>
         <w:rPr>
           <w:lang w:val="en-US"/>
@@ -963,62 +761,20 @@
         <w:rPr>
           <w:lang w:val="en-US"/>
         </w:rPr>
-        <w:t xml:space="preserve">Run </w:t>
-      </w:r>
-      <w:proofErr w:type="spellStart"/>
-      <w:r>
-        <w:rPr>
-          <w:lang w:val="en-US"/>
-        </w:rPr>
-        <w:t>main.prg</w:t>
-      </w:r>
-      <w:proofErr w:type="spellEnd"/>
-      <w:r>
-        <w:rPr>
-          <w:lang w:val="en-US"/>
-        </w:rPr>
-        <w:t xml:space="preserve"> by pressing run in the upper left corner. </w:t>
-      </w:r>
-    </w:p>
-    <w:p>
-      <w:pPr>
-        <w:rPr>
-          <w:lang w:val="en-US"/>
-        </w:rPr>
-      </w:pPr>
-      <w:r>
-        <w:rPr>
-          <w:lang w:val="en-US"/>
-        </w:rPr>
-        <w:t xml:space="preserve">This creates </w:t>
-      </w:r>
-      <w:proofErr w:type="spellStart"/>
-      <w:r>
-        <w:rPr>
-          <w:lang w:val="en-US"/>
-        </w:rPr>
-        <w:t>workfile</w:t>
-      </w:r>
-      <w:proofErr w:type="spellEnd"/>
-      <w:r>
-        <w:rPr>
-          <w:lang w:val="en-US"/>
-        </w:rPr>
-        <w:t xml:space="preserve"> that makes use of the calibrated </w:t>
-      </w:r>
-      <w:proofErr w:type="spellStart"/>
-      <w:r>
-        <w:rPr>
-          <w:lang w:val="en-US"/>
-        </w:rPr>
-        <w:t>workfile</w:t>
-      </w:r>
-      <w:proofErr w:type="spellEnd"/>
-      <w:r>
-        <w:rPr>
-          <w:lang w:val="en-US"/>
-        </w:rPr>
-        <w:t xml:space="preserve">. All the variables that belong to the scenario are given with _2, all variables that belong to the calibrated baseline are indicated with _0. </w:t>
+        <w:t xml:space="preserve">Run main.prg by pressing run in the upper left corner. </w:t>
+      </w:r>
+    </w:p>
+    <w:p>
+      <w:pPr>
+        <w:rPr>
+          <w:lang w:val="en-US"/>
+        </w:rPr>
+      </w:pPr>
+      <w:r>
+        <w:rPr>
+          <w:lang w:val="en-US"/>
+        </w:rPr>
+        <w:t xml:space="preserve">This creates workfile that makes use of the calibrated workfile. All the variables that belong to the scenario are given with _2, all variables that belong to the calibrated baseline are indicated with _0. </w:t>
       </w:r>
     </w:p>
     <w:p>
@@ -1066,21 +822,7 @@
         <w:rPr>
           <w:lang w:val="en-US"/>
         </w:rPr>
-        <w:t xml:space="preserve">The paper presents one baseline scenario and 3 price scenarios. All four scenarios can be run under the label </w:t>
-      </w:r>
-      <w:proofErr w:type="spellStart"/>
-      <w:r>
-        <w:rPr>
-          <w:lang w:val="en-US"/>
-        </w:rPr>
-        <w:t>scenario_name</w:t>
-      </w:r>
-      <w:proofErr w:type="spellEnd"/>
-      <w:r>
-        <w:rPr>
-          <w:lang w:val="en-US"/>
-        </w:rPr>
-        <w:t xml:space="preserve"> = baseline. (The naming here might be confusing.) However, we will change the excel sheets that are imported for the scenario. </w:t>
+        <w:t xml:space="preserve">The paper presents one baseline scenario and 3 price scenarios. All four scenarios can be run under the label scenario_name = baseline. (The naming here might be confusing.) However, we will change the excel sheets that are imported for the scenario. </w:t>
       </w:r>
     </w:p>
     <w:p>
@@ -1098,49 +840,7 @@
         <w:rPr>
           <w:lang w:val="en-US"/>
         </w:rPr>
-        <w:t xml:space="preserve">For running price scenario 1, adjust the code under </w:t>
-      </w:r>
-      <w:proofErr w:type="spellStart"/>
-      <w:r>
-        <w:rPr>
-          <w:lang w:val="en-US"/>
-        </w:rPr>
-        <w:t>scr</w:t>
-      </w:r>
-      <w:proofErr w:type="spellEnd"/>
-      <w:r>
-        <w:rPr>
-          <w:lang w:val="en-US"/>
-        </w:rPr>
-        <w:t>/</w:t>
-      </w:r>
-      <w:proofErr w:type="spellStart"/>
-      <w:r>
-        <w:rPr>
-          <w:lang w:val="en-US"/>
-        </w:rPr>
-        <w:t>Eviews</w:t>
-      </w:r>
-      <w:proofErr w:type="spellEnd"/>
-      <w:r>
-        <w:rPr>
-          <w:lang w:val="en-US"/>
-        </w:rPr>
-        <w:t>/</w:t>
-      </w:r>
-      <w:proofErr w:type="spellStart"/>
-      <w:r>
-        <w:rPr>
-          <w:lang w:val="en-US"/>
-        </w:rPr>
-        <w:t>run_extra.prg</w:t>
-      </w:r>
-      <w:proofErr w:type="spellEnd"/>
-      <w:r>
-        <w:rPr>
-          <w:lang w:val="en-US"/>
-        </w:rPr>
-        <w:t xml:space="preserve"> as follows: </w:t>
+        <w:t xml:space="preserve">For running price scenario 1, adjust the code under scr/Eviews/run_extra.prg as follows: </w:t>
       </w:r>
       <w:r>
         <w:rPr>
@@ -1223,16 +923,8 @@
         <w:rPr>
           <w:lang w:val="en-US"/>
         </w:rPr>
-        <w:t xml:space="preserve">Run the scenario via pressing run in </w:t>
-      </w:r>
-      <w:proofErr w:type="spellStart"/>
-      <w:r>
-        <w:rPr>
-          <w:lang w:val="en-US"/>
-        </w:rPr>
-        <w:t>main.prg</w:t>
-      </w:r>
-      <w:proofErr w:type="spellEnd"/>
+        <w:t>Run the scenario via pressing run in main.prg</w:t>
+      </w:r>
     </w:p>
     <w:p>
       <w:pPr>
@@ -1398,21 +1090,7 @@
         <w:rPr>
           <w:lang w:val="en-US"/>
         </w:rPr>
-        <w:t xml:space="preserve">Baseline scenario: copy-paste the whole sheet with results in sheet </w:t>
-      </w:r>
-      <w:proofErr w:type="spellStart"/>
-      <w:r>
-        <w:rPr>
-          <w:lang w:val="en-US"/>
-        </w:rPr>
-        <w:t>Baseline_raw</w:t>
-      </w:r>
-      <w:proofErr w:type="spellEnd"/>
-      <w:r>
-        <w:rPr>
-          <w:lang w:val="en-US"/>
-        </w:rPr>
-        <w:t xml:space="preserve">. </w:t>
+        <w:t xml:space="preserve">Baseline scenario: copy-paste the whole sheet with results in sheet Baseline_raw. </w:t>
       </w:r>
     </w:p>
     <w:p>
@@ -3739,6 +3417,15 @@
 </file>
 
 <file path=customXml/item1.xml><?xml version="1.0" encoding="utf-8"?>
+<?mso-contentType ?>
+<FormTemplates xmlns="http://schemas.microsoft.com/sharepoint/v3/contenttype/forms">
+  <Display>DocumentLibraryForm</Display>
+  <Edit>DocumentLibraryForm</Edit>
+  <New>DocumentLibraryForm</New>
+</FormTemplates>
+</file>
+
+<file path=customXml/item2.xml><?xml version="1.0" encoding="utf-8"?>
 <ct:contentTypeSchema xmlns:ct="http://schemas.microsoft.com/office/2006/metadata/contentType" xmlns:ma="http://schemas.microsoft.com/office/2006/metadata/properties/metaAttributes" ct:_="" ma:_="" ma:contentTypeName="Team Document" ma:contentTypeID="0x010100A35317DCC28344A7B82488658A034A5C0100FB707EEC1EA8C64F95929925D879C502" ma:contentTypeVersion="14" ma:contentTypeDescription=" " ma:contentTypeScope="" ma:versionID="fcaf3bc967938c03b13ae3a47ef417f6">
   <xsd:schema xmlns:xsd="http://www.w3.org/2001/XMLSchema" xmlns:xs="http://www.w3.org/2001/XMLSchema" xmlns:p="http://schemas.microsoft.com/office/2006/metadata/properties" xmlns:ns2="c463f51e-4dec-4a9c-9d0f-3527336f327b" xmlns:ns3="2f6a910d-138e-42c1-8e8a-320c1b7cf3f7" xmlns:ns5="1c0a0543-f898-4216-b5b3-85b5b42fc6f2" targetNamespace="http://schemas.microsoft.com/office/2006/metadata/properties" ma:root="true" ma:fieldsID="1f9120e319e56c099e7e0727247b6e8d" ns2:_="" ns3:_="" ns5:_="">
     <xsd:import namespace="c463f51e-4dec-4a9c-9d0f-3527336f327b"/>
@@ -4051,16 +3738,53 @@
 </ct:contentTypeSchema>
 </file>
 
-<file path=customXml/item2.xml><?xml version="1.0" encoding="utf-8"?>
-<?mso-contentType ?>
-<FormTemplates xmlns="http://schemas.microsoft.com/sharepoint/v3/contenttype/forms">
-  <Display>DocumentLibraryForm</Display>
-  <Edit>DocumentLibraryForm</Edit>
-  <New>DocumentLibraryForm</New>
-</FormTemplates>
+<file path=customXml/item3.xml><?xml version="1.0" encoding="utf-8"?>
+<p:properties xmlns:p="http://schemas.microsoft.com/office/2006/metadata/properties" xmlns:xsi="http://www.w3.org/2001/XMLSchema-instance" xmlns:pc="http://schemas.microsoft.com/office/infopath/2007/PartnerControls">
+  <documentManagement>
+    <TNOC_ClusterName xmlns="2f6a910d-138e-42c1-8e8a-320c1b7cf3f7">KIP 2022 Exploring the macro-economic</TNOC_ClusterName>
+    <n2a7a23bcc2241cb9261f9a914c7c1bb xmlns="c463f51e-4dec-4a9c-9d0f-3527336f327b">
+      <Terms xmlns="http://schemas.microsoft.com/office/infopath/2007/PartnerControls">
+        <TermInfo xmlns="http://schemas.microsoft.com/office/infopath/2007/PartnerControls">
+          <TermName xmlns="http://schemas.microsoft.com/office/infopath/2007/PartnerControls">TNO Internal</TermName>
+          <TermId xmlns="http://schemas.microsoft.com/office/infopath/2007/PartnerControls">1a23c89f-ef54-4907-86fd-8242403ff722</TermId>
+        </TermInfo>
+      </Terms>
+    </n2a7a23bcc2241cb9261f9a914c7c1bb>
+    <TNOC_ClusterId xmlns="2f6a910d-138e-42c1-8e8a-320c1b7cf3f7">060.51637</TNOC_ClusterId>
+    <cf581d8792c646118aad2c2c4ecdfa8c xmlns="c463f51e-4dec-4a9c-9d0f-3527336f327b">
+      <Terms xmlns="http://schemas.microsoft.com/office/infopath/2007/PartnerControls"/>
+    </cf581d8792c646118aad2c2c4ecdfa8c>
+    <lcf76f155ced4ddcb4097134ff3c332f xmlns="1c0a0543-f898-4216-b5b3-85b5b42fc6f2">
+      <Terms xmlns="http://schemas.microsoft.com/office/infopath/2007/PartnerControls"/>
+    </lcf76f155ced4ddcb4097134ff3c332f>
+    <lca20d149a844688b6abf34073d5c21d xmlns="c463f51e-4dec-4a9c-9d0f-3527336f327b">
+      <Terms xmlns="http://schemas.microsoft.com/office/infopath/2007/PartnerControls"/>
+    </lca20d149a844688b6abf34073d5c21d>
+    <TaxCatchAll xmlns="c463f51e-4dec-4a9c-9d0f-3527336f327b">
+      <Value>5</Value>
+      <Value>1</Value>
+    </TaxCatchAll>
+    <bac4ab11065f4f6c809c820c57e320e5 xmlns="c463f51e-4dec-4a9c-9d0f-3527336f327b">
+      <Terms xmlns="http://schemas.microsoft.com/office/infopath/2007/PartnerControls"/>
+    </bac4ab11065f4f6c809c820c57e320e5>
+    <h15fbb78f4cb41d290e72f301ea2865f xmlns="c463f51e-4dec-4a9c-9d0f-3527336f327b">
+      <Terms xmlns="http://schemas.microsoft.com/office/infopath/2007/PartnerControls">
+        <TermInfo xmlns="http://schemas.microsoft.com/office/infopath/2007/PartnerControls">
+          <TermName xmlns="http://schemas.microsoft.com/office/infopath/2007/PartnerControls">Project</TermName>
+          <TermId xmlns="http://schemas.microsoft.com/office/infopath/2007/PartnerControls">fa11c4c9-105f-402c-bb40-9a56b4989397</TermId>
+        </TermInfo>
+      </Terms>
+    </h15fbb78f4cb41d290e72f301ea2865f>
+    <_dlc_DocId xmlns="c463f51e-4dec-4a9c-9d0f-3527336f327b">QVQ5D6UYX565-1821469542-810</_dlc_DocId>
+    <_dlc_DocIdUrl xmlns="c463f51e-4dec-4a9c-9d0f-3527336f327b">
+      <Url>https://365tno.sharepoint.com/teams/P060.51637/_layouts/15/DocIdRedir.aspx?ID=QVQ5D6UYX565-1821469542-810</Url>
+      <Description>QVQ5D6UYX565-1821469542-810</Description>
+    </_dlc_DocIdUrl>
+  </documentManagement>
+</p:properties>
 </file>
 
-<file path=customXml/item3.xml><?xml version="1.0" encoding="utf-8"?>
+<file path=customXml/item4.xml><?xml version="1.0" encoding="utf-8"?>
 <?mso-contentType ?>
 <spe:Receivers xmlns:spe="http://schemas.microsoft.com/sharepoint/events">
   <Receiver>
@@ -4110,53 +3834,15 @@
 </spe:Receivers>
 </file>
 
-<file path=customXml/item4.xml><?xml version="1.0" encoding="utf-8"?>
-<p:properties xmlns:p="http://schemas.microsoft.com/office/2006/metadata/properties" xmlns:xsi="http://www.w3.org/2001/XMLSchema-instance" xmlns:pc="http://schemas.microsoft.com/office/infopath/2007/PartnerControls">
-  <documentManagement>
-    <TNOC_ClusterName xmlns="2f6a910d-138e-42c1-8e8a-320c1b7cf3f7">KIP 2022 Exploring the macro-economic</TNOC_ClusterName>
-    <n2a7a23bcc2241cb9261f9a914c7c1bb xmlns="c463f51e-4dec-4a9c-9d0f-3527336f327b">
-      <Terms xmlns="http://schemas.microsoft.com/office/infopath/2007/PartnerControls">
-        <TermInfo xmlns="http://schemas.microsoft.com/office/infopath/2007/PartnerControls">
-          <TermName xmlns="http://schemas.microsoft.com/office/infopath/2007/PartnerControls">TNO Internal</TermName>
-          <TermId xmlns="http://schemas.microsoft.com/office/infopath/2007/PartnerControls">1a23c89f-ef54-4907-86fd-8242403ff722</TermId>
-        </TermInfo>
-      </Terms>
-    </n2a7a23bcc2241cb9261f9a914c7c1bb>
-    <TNOC_ClusterId xmlns="2f6a910d-138e-42c1-8e8a-320c1b7cf3f7">060.51637</TNOC_ClusterId>
-    <cf581d8792c646118aad2c2c4ecdfa8c xmlns="c463f51e-4dec-4a9c-9d0f-3527336f327b">
-      <Terms xmlns="http://schemas.microsoft.com/office/infopath/2007/PartnerControls"/>
-    </cf581d8792c646118aad2c2c4ecdfa8c>
-    <lcf76f155ced4ddcb4097134ff3c332f xmlns="1c0a0543-f898-4216-b5b3-85b5b42fc6f2">
-      <Terms xmlns="http://schemas.microsoft.com/office/infopath/2007/PartnerControls"/>
-    </lcf76f155ced4ddcb4097134ff3c332f>
-    <lca20d149a844688b6abf34073d5c21d xmlns="c463f51e-4dec-4a9c-9d0f-3527336f327b">
-      <Terms xmlns="http://schemas.microsoft.com/office/infopath/2007/PartnerControls"/>
-    </lca20d149a844688b6abf34073d5c21d>
-    <TaxCatchAll xmlns="c463f51e-4dec-4a9c-9d0f-3527336f327b">
-      <Value>5</Value>
-      <Value>1</Value>
-    </TaxCatchAll>
-    <bac4ab11065f4f6c809c820c57e320e5 xmlns="c463f51e-4dec-4a9c-9d0f-3527336f327b">
-      <Terms xmlns="http://schemas.microsoft.com/office/infopath/2007/PartnerControls"/>
-    </bac4ab11065f4f6c809c820c57e320e5>
-    <h15fbb78f4cb41d290e72f301ea2865f xmlns="c463f51e-4dec-4a9c-9d0f-3527336f327b">
-      <Terms xmlns="http://schemas.microsoft.com/office/infopath/2007/PartnerControls">
-        <TermInfo xmlns="http://schemas.microsoft.com/office/infopath/2007/PartnerControls">
-          <TermName xmlns="http://schemas.microsoft.com/office/infopath/2007/PartnerControls">Project</TermName>
-          <TermId xmlns="http://schemas.microsoft.com/office/infopath/2007/PartnerControls">fa11c4c9-105f-402c-bb40-9a56b4989397</TermId>
-        </TermInfo>
-      </Terms>
-    </h15fbb78f4cb41d290e72f301ea2865f>
-    <_dlc_DocId xmlns="c463f51e-4dec-4a9c-9d0f-3527336f327b">QVQ5D6UYX565-1821469542-810</_dlc_DocId>
-    <_dlc_DocIdUrl xmlns="c463f51e-4dec-4a9c-9d0f-3527336f327b">
-      <Url>https://365tno.sharepoint.com/teams/P060.51637/_layouts/15/DocIdRedir.aspx?ID=QVQ5D6UYX565-1821469542-810</Url>
-      <Description>QVQ5D6UYX565-1821469542-810</Description>
-    </_dlc_DocIdUrl>
-  </documentManagement>
-</p:properties>
+<file path=customXml/itemProps1.xml><?xml version="1.0" encoding="utf-8"?>
+<ds:datastoreItem xmlns:ds="http://schemas.openxmlformats.org/officeDocument/2006/customXml" ds:itemID="{436FFD75-E26C-4621-B387-BD8D30703D90}">
+  <ds:schemaRefs>
+    <ds:schemaRef ds:uri="http://schemas.microsoft.com/sharepoint/v3/contenttype/forms"/>
+  </ds:schemaRefs>
+</ds:datastoreItem>
 </file>
 
-<file path=customXml/itemProps1.xml><?xml version="1.0" encoding="utf-8"?>
+<file path=customXml/itemProps2.xml><?xml version="1.0" encoding="utf-8"?>
 <ds:datastoreItem xmlns:ds="http://schemas.openxmlformats.org/officeDocument/2006/customXml" ds:itemID="{CBED39DF-A893-4D9D-96C8-97723B33C8A0}">
   <ds:schemaRefs>
     <ds:schemaRef ds:uri="http://schemas.microsoft.com/office/2006/metadata/contentType"/>
@@ -4176,23 +3862,7 @@
 </ds:datastoreItem>
 </file>
 
-<file path=customXml/itemProps2.xml><?xml version="1.0" encoding="utf-8"?>
-<ds:datastoreItem xmlns:ds="http://schemas.openxmlformats.org/officeDocument/2006/customXml" ds:itemID="{436FFD75-E26C-4621-B387-BD8D30703D90}">
-  <ds:schemaRefs>
-    <ds:schemaRef ds:uri="http://schemas.microsoft.com/sharepoint/v3/contenttype/forms"/>
-  </ds:schemaRefs>
-</ds:datastoreItem>
-</file>
-
 <file path=customXml/itemProps3.xml><?xml version="1.0" encoding="utf-8"?>
-<ds:datastoreItem xmlns:ds="http://schemas.openxmlformats.org/officeDocument/2006/customXml" ds:itemID="{BCB2C537-DE51-49E5-9B98-714FD3F82AA2}">
-  <ds:schemaRefs>
-    <ds:schemaRef ds:uri="http://schemas.microsoft.com/sharepoint/events"/>
-  </ds:schemaRefs>
-</ds:datastoreItem>
-</file>
-
-<file path=customXml/itemProps4.xml><?xml version="1.0" encoding="utf-8"?>
 <ds:datastoreItem xmlns:ds="http://schemas.openxmlformats.org/officeDocument/2006/customXml" ds:itemID="{23FB51A9-31CB-453C-88AD-A8B7359DD29F}">
   <ds:schemaRefs>
     <ds:schemaRef ds:uri="http://schemas.microsoft.com/office/2006/metadata/properties"/>
@@ -4202,4 +3872,12 @@
     <ds:schemaRef ds:uri="1c0a0543-f898-4216-b5b3-85b5b42fc6f2"/>
   </ds:schemaRefs>
 </ds:datastoreItem>
+</file>
+
+<file path=customXml/itemProps4.xml><?xml version="1.0" encoding="utf-8"?>
+<ds:datastoreItem xmlns:ds="http://schemas.openxmlformats.org/officeDocument/2006/customXml" ds:itemID="{BCB2C537-DE51-49E5-9B98-714FD3F82AA2}">
+  <ds:schemaRefs>
+    <ds:schemaRef ds:uri="http://schemas.microsoft.com/sharepoint/events"/>
+  </ds:schemaRefs>
+</ds:datastoreItem>
 </file>
</xml_diff>

<commit_message>
final changes to the model
</commit_message>
<xml_diff>
--- a/doc/Manual for running the ThreeME model for results in paper.docx
+++ b/doc/Manual for running the ThreeME model for results in paper.docx
@@ -16,7 +16,25 @@
           <w:bCs/>
           <w:lang w:val="en-US"/>
         </w:rPr>
-        <w:t>Manual for running the ThreeME model for results in paper “Mitigating Foreign Fossil Fuel Shocks: The Role of Renewable Energy and Industrial Electrification in the Netherlands”</w:t>
+        <w:t xml:space="preserve">Manual for running the </w:t>
+      </w:r>
+      <w:proofErr w:type="spellStart"/>
+      <w:r>
+        <w:rPr>
+          <w:b/>
+          <w:bCs/>
+          <w:lang w:val="en-US"/>
+        </w:rPr>
+        <w:t>ThreeME</w:t>
+      </w:r>
+      <w:proofErr w:type="spellEnd"/>
+      <w:r>
+        <w:rPr>
+          <w:b/>
+          <w:bCs/>
+          <w:lang w:val="en-US"/>
+        </w:rPr>
+        <w:t xml:space="preserve"> model for results in paper “Mitigating Foreign Fossil Fuel Shocks: The Role of Renewable Energy and Industrial Electrification in the Netherlands”</w:t>
       </w:r>
     </w:p>
     <w:p>
@@ -51,7 +69,21 @@
         <w:rPr>
           <w:lang w:val="en-US"/>
         </w:rPr>
-        <w:t xml:space="preserve">Download Eviews, and make sure that you have a license. </w:t>
+        <w:t xml:space="preserve">Download </w:t>
+      </w:r>
+      <w:proofErr w:type="spellStart"/>
+      <w:r>
+        <w:rPr>
+          <w:lang w:val="en-US"/>
+        </w:rPr>
+        <w:t>Eviews</w:t>
+      </w:r>
+      <w:proofErr w:type="spellEnd"/>
+      <w:r>
+        <w:rPr>
+          <w:lang w:val="en-US"/>
+        </w:rPr>
+        <w:t xml:space="preserve">, and make sure that you have a license. </w:t>
       </w:r>
     </w:p>
     <w:p>
@@ -69,7 +101,21 @@
         <w:rPr>
           <w:lang w:val="en-US"/>
         </w:rPr>
-        <w:t xml:space="preserve">Make sure you have a github account and take the model from </w:t>
+        <w:t xml:space="preserve">Make sure you have a </w:t>
+      </w:r>
+      <w:proofErr w:type="spellStart"/>
+      <w:r>
+        <w:rPr>
+          <w:lang w:val="en-US"/>
+        </w:rPr>
+        <w:t>github</w:t>
+      </w:r>
+      <w:proofErr w:type="spellEnd"/>
+      <w:r>
+        <w:rPr>
+          <w:lang w:val="en-US"/>
+        </w:rPr>
+        <w:t xml:space="preserve"> account and take the model from </w:t>
       </w:r>
     </w:p>
     <w:p>
@@ -137,6 +183,147 @@
     </w:p>
     <w:p>
       <w:pPr>
+        <w:pStyle w:val="ListParagraph"/>
+        <w:numPr>
+          <w:ilvl w:val="0"/>
+          <w:numId w:val="8"/>
+        </w:numPr>
+        <w:rPr>
+          <w:lang w:val="en-US"/>
+        </w:rPr>
+      </w:pPr>
+      <w:r>
+        <w:rPr>
+          <w:lang w:val="en-US"/>
+        </w:rPr>
+        <w:t xml:space="preserve">Make sure that </w:t>
+      </w:r>
+      <w:proofErr w:type="spellStart"/>
+      <w:r>
+        <w:rPr>
+          <w:lang w:val="en-US"/>
+        </w:rPr>
+        <w:t>Eviews</w:t>
+      </w:r>
+      <w:proofErr w:type="spellEnd"/>
+      <w:r>
+        <w:rPr>
+          <w:lang w:val="en-US"/>
+        </w:rPr>
+        <w:t xml:space="preserve"> knows </w:t>
+      </w:r>
+      <w:proofErr w:type="spellStart"/>
+      <w:r>
+        <w:rPr>
+          <w:lang w:val="en-US"/>
+        </w:rPr>
+        <w:t>your</w:t>
+      </w:r>
+      <w:proofErr w:type="spellEnd"/>
+      <w:r>
+        <w:rPr>
+          <w:lang w:val="en-US"/>
+        </w:rPr>
+        <w:t xml:space="preserve"> working directory</w:t>
+      </w:r>
+    </w:p>
+    <w:p>
+      <w:pPr>
+        <w:pStyle w:val="ListParagraph"/>
+        <w:numPr>
+          <w:ilvl w:val="1"/>
+          <w:numId w:val="8"/>
+        </w:numPr>
+        <w:rPr>
+          <w:lang w:val="en-US"/>
+        </w:rPr>
+      </w:pPr>
+      <w:r>
+        <w:rPr>
+          <w:lang w:val="en-US"/>
+        </w:rPr>
+        <w:t xml:space="preserve">Open </w:t>
+      </w:r>
+      <w:proofErr w:type="spellStart"/>
+      <w:r>
+        <w:rPr>
+          <w:lang w:val="en-US"/>
+        </w:rPr>
+        <w:t>Eviews</w:t>
+      </w:r>
+      <w:proofErr w:type="spellEnd"/>
+      <w:r>
+        <w:rPr>
+          <w:lang w:val="en-US"/>
+        </w:rPr>
+        <w:t xml:space="preserve">, go to options in the </w:t>
+      </w:r>
+      <w:proofErr w:type="spellStart"/>
+      <w:r>
+        <w:rPr>
+          <w:lang w:val="en-US"/>
+        </w:rPr>
+        <w:t>taskmenu</w:t>
+      </w:r>
+      <w:proofErr w:type="spellEnd"/>
+      <w:r>
+        <w:rPr>
+          <w:lang w:val="en-US"/>
+        </w:rPr>
+        <w:t>, click on general options. Go to ‘file locations’, and make sure that the model knows where to find the model (“current data path”)</w:t>
+      </w:r>
+    </w:p>
+    <w:p>
+      <w:pPr>
+        <w:pStyle w:val="ListParagraph"/>
+        <w:ind w:left="1440"/>
+        <w:rPr>
+          <w:lang w:val="en-US"/>
+        </w:rPr>
+      </w:pPr>
+      <w:r>
+        <w:rPr>
+          <w:lang w:val="en-US"/>
+        </w:rPr>
+        <w:drawing>
+          <wp:inline distT="0" distB="0" distL="0" distR="0" wp14:anchorId="2B26E171" wp14:editId="0DA387B1">
+            <wp:extent cx="5029636" cy="3619814"/>
+            <wp:effectExtent l="0" t="0" r="0" b="0"/>
+            <wp:docPr id="771418208" name="Picture 1"/>
+            <wp:cNvGraphicFramePr>
+              <a:graphicFrameLocks xmlns:a="http://schemas.openxmlformats.org/drawingml/2006/main" noChangeAspect="1"/>
+            </wp:cNvGraphicFramePr>
+            <a:graphic xmlns:a="http://schemas.openxmlformats.org/drawingml/2006/main">
+              <a:graphicData uri="http://schemas.openxmlformats.org/drawingml/2006/picture">
+                <pic:pic xmlns:pic="http://schemas.openxmlformats.org/drawingml/2006/picture">
+                  <pic:nvPicPr>
+                    <pic:cNvPr id="771418208" name=""/>
+                    <pic:cNvPicPr/>
+                  </pic:nvPicPr>
+                  <pic:blipFill>
+                    <a:blip r:embed="rId10"/>
+                    <a:stretch>
+                      <a:fillRect/>
+                    </a:stretch>
+                  </pic:blipFill>
+                  <pic:spPr>
+                    <a:xfrm>
+                      <a:off x="0" y="0"/>
+                      <a:ext cx="5029636" cy="3619814"/>
+                    </a:xfrm>
+                    <a:prstGeom prst="rect">
+                      <a:avLst/>
+                    </a:prstGeom>
+                  </pic:spPr>
+                </pic:pic>
+              </a:graphicData>
+            </a:graphic>
+          </wp:inline>
+        </w:drawing>
+      </w:r>
+    </w:p>
+    <w:p>
+      <w:pPr>
         <w:rPr>
           <w:b/>
           <w:bCs/>
@@ -167,7 +354,21 @@
         <w:rPr>
           <w:lang w:val="en-US"/>
         </w:rPr>
-        <w:t>Open software program Eviews.</w:t>
+        <w:t xml:space="preserve">Open software program </w:t>
+      </w:r>
+      <w:proofErr w:type="spellStart"/>
+      <w:r>
+        <w:rPr>
+          <w:lang w:val="en-US"/>
+        </w:rPr>
+        <w:t>Eviews</w:t>
+      </w:r>
+      <w:proofErr w:type="spellEnd"/>
+      <w:r>
+        <w:rPr>
+          <w:lang w:val="en-US"/>
+        </w:rPr>
+        <w:t>.</w:t>
       </w:r>
     </w:p>
     <w:p>
@@ -185,7 +386,49 @@
         <w:rPr>
           <w:lang w:val="en-US"/>
         </w:rPr>
-        <w:t xml:space="preserve">Open file scr/Eviews/main.prg, via File </w:t>
+        <w:t xml:space="preserve">Open file </w:t>
+      </w:r>
+      <w:proofErr w:type="spellStart"/>
+      <w:r>
+        <w:rPr>
+          <w:lang w:val="en-US"/>
+        </w:rPr>
+        <w:t>scr</w:t>
+      </w:r>
+      <w:proofErr w:type="spellEnd"/>
+      <w:r>
+        <w:rPr>
+          <w:lang w:val="en-US"/>
+        </w:rPr>
+        <w:t>/</w:t>
+      </w:r>
+      <w:proofErr w:type="spellStart"/>
+      <w:r>
+        <w:rPr>
+          <w:lang w:val="en-US"/>
+        </w:rPr>
+        <w:t>Eviews</w:t>
+      </w:r>
+      <w:proofErr w:type="spellEnd"/>
+      <w:r>
+        <w:rPr>
+          <w:lang w:val="en-US"/>
+        </w:rPr>
+        <w:t>/</w:t>
+      </w:r>
+      <w:proofErr w:type="spellStart"/>
+      <w:r>
+        <w:rPr>
+          <w:lang w:val="en-US"/>
+        </w:rPr>
+        <w:t>main.prg</w:t>
+      </w:r>
+      <w:proofErr w:type="spellEnd"/>
+      <w:r>
+        <w:rPr>
+          <w:lang w:val="en-US"/>
+        </w:rPr>
+        <w:t xml:space="preserve">, via File </w:t>
       </w:r>
       <w:r>
         <w:rPr>
@@ -276,7 +519,7 @@
                     <pic:cNvPicPr/>
                   </pic:nvPicPr>
                   <pic:blipFill>
-                    <a:blip r:embed="rId10"/>
+                    <a:blip r:embed="rId11"/>
                     <a:stretch>
                       <a:fillRect/>
                     </a:stretch>
@@ -335,44 +578,6 @@
     </w:p>
     <w:p>
       <w:pPr>
-        <w:rPr>
-          <w:lang w:val="en-US"/>
-        </w:rPr>
-      </w:pPr>
-      <w:r>
-        <w:rPr>
-          <w:lang w:val="en-US"/>
-        </w:rPr>
-        <w:t xml:space="preserve">This creates a new workfile in which the parameters are calibrated for the baseline. </w:t>
-      </w:r>
-    </w:p>
-    <w:p>
-      <w:pPr>
-        <w:rPr>
-          <w:b/>
-          <w:bCs/>
-          <w:lang w:val="en-US"/>
-        </w:rPr>
-      </w:pPr>
-      <w:r>
-        <w:rPr>
-          <w:b/>
-          <w:bCs/>
-          <w:lang w:val="en-US"/>
-        </w:rPr>
-        <w:t xml:space="preserve">Run </w:t>
-      </w:r>
-      <w:r>
-        <w:rPr>
-          <w:b/>
-          <w:bCs/>
-          <w:lang w:val="en-US"/>
-        </w:rPr>
-        <w:t>the baseline scenario</w:t>
-      </w:r>
-    </w:p>
-    <w:p>
-      <w:pPr>
         <w:pStyle w:val="ListParagraph"/>
         <w:numPr>
           <w:ilvl w:val="0"/>
@@ -386,13 +591,341 @@
         <w:rPr>
           <w:lang w:val="en-US"/>
         </w:rPr>
+        <w:lastRenderedPageBreak/>
+        <w:t xml:space="preserve">When you see this screen, press OK </w:t>
+      </w:r>
+      <w:r>
+        <w:rPr>
+          <w:lang w:val="en-US"/>
+        </w:rPr>
+        <w:br/>
+      </w:r>
+      <w:r>
+        <w:rPr>
+          <w:lang w:val="en-US"/>
+        </w:rPr>
+        <w:drawing>
+          <wp:inline distT="0" distB="0" distL="0" distR="0" wp14:anchorId="36D5012A" wp14:editId="249A6F84">
+            <wp:extent cx="3292125" cy="3017782"/>
+            <wp:effectExtent l="0" t="0" r="3810" b="0"/>
+            <wp:docPr id="1766321151" name="Picture 1"/>
+            <wp:cNvGraphicFramePr>
+              <a:graphicFrameLocks xmlns:a="http://schemas.openxmlformats.org/drawingml/2006/main" noChangeAspect="1"/>
+            </wp:cNvGraphicFramePr>
+            <a:graphic xmlns:a="http://schemas.openxmlformats.org/drawingml/2006/main">
+              <a:graphicData uri="http://schemas.openxmlformats.org/drawingml/2006/picture">
+                <pic:pic xmlns:pic="http://schemas.openxmlformats.org/drawingml/2006/picture">
+                  <pic:nvPicPr>
+                    <pic:cNvPr id="1766321151" name=""/>
+                    <pic:cNvPicPr/>
+                  </pic:nvPicPr>
+                  <pic:blipFill>
+                    <a:blip r:embed="rId12"/>
+                    <a:stretch>
+                      <a:fillRect/>
+                    </a:stretch>
+                  </pic:blipFill>
+                  <pic:spPr>
+                    <a:xfrm>
+                      <a:off x="0" y="0"/>
+                      <a:ext cx="3292125" cy="3017782"/>
+                    </a:xfrm>
+                    <a:prstGeom prst="rect">
+                      <a:avLst/>
+                    </a:prstGeom>
+                  </pic:spPr>
+                </pic:pic>
+              </a:graphicData>
+            </a:graphic>
+          </wp:inline>
+        </w:drawing>
+      </w:r>
+    </w:p>
+    <w:p>
+      <w:pPr>
+        <w:pStyle w:val="ListParagraph"/>
+        <w:numPr>
+          <w:ilvl w:val="0"/>
+          <w:numId w:val="1"/>
+        </w:numPr>
+        <w:rPr>
+          <w:lang w:val="en-US"/>
+        </w:rPr>
+      </w:pPr>
+      <w:r>
+        <w:rPr>
+          <w:lang w:val="en-US"/>
+        </w:rPr>
+        <w:t>When you see this screen, press OK</w:t>
+      </w:r>
+      <w:r>
+        <w:rPr>
+          <w:lang w:val="en-US"/>
+        </w:rPr>
+        <w:br/>
+      </w:r>
+      <w:r>
+        <w:rPr>
+          <w:lang w:val="en-US"/>
+        </w:rPr>
+        <w:drawing>
+          <wp:inline distT="0" distB="0" distL="0" distR="0" wp14:anchorId="7C47DA66" wp14:editId="6B92788F">
+            <wp:extent cx="2644369" cy="1226926"/>
+            <wp:effectExtent l="0" t="0" r="3810" b="0"/>
+            <wp:docPr id="151717779" name="Picture 1"/>
+            <wp:cNvGraphicFramePr>
+              <a:graphicFrameLocks xmlns:a="http://schemas.openxmlformats.org/drawingml/2006/main" noChangeAspect="1"/>
+            </wp:cNvGraphicFramePr>
+            <a:graphic xmlns:a="http://schemas.openxmlformats.org/drawingml/2006/main">
+              <a:graphicData uri="http://schemas.openxmlformats.org/drawingml/2006/picture">
+                <pic:pic xmlns:pic="http://schemas.openxmlformats.org/drawingml/2006/picture">
+                  <pic:nvPicPr>
+                    <pic:cNvPr id="151717779" name=""/>
+                    <pic:cNvPicPr/>
+                  </pic:nvPicPr>
+                  <pic:blipFill>
+                    <a:blip r:embed="rId13"/>
+                    <a:stretch>
+                      <a:fillRect/>
+                    </a:stretch>
+                  </pic:blipFill>
+                  <pic:spPr>
+                    <a:xfrm>
+                      <a:off x="0" y="0"/>
+                      <a:ext cx="2644369" cy="1226926"/>
+                    </a:xfrm>
+                    <a:prstGeom prst="rect">
+                      <a:avLst/>
+                    </a:prstGeom>
+                  </pic:spPr>
+                </pic:pic>
+              </a:graphicData>
+            </a:graphic>
+          </wp:inline>
+        </w:drawing>
+      </w:r>
+    </w:p>
+    <w:p>
+      <w:pPr>
+        <w:pStyle w:val="ListParagraph"/>
+        <w:numPr>
+          <w:ilvl w:val="0"/>
+          <w:numId w:val="1"/>
+        </w:numPr>
+        <w:rPr>
+          <w:lang w:val="en-US"/>
+        </w:rPr>
+      </w:pPr>
+      <w:r>
+        <w:rPr>
+          <w:lang w:val="en-US"/>
+        </w:rPr>
+        <w:t>When you see this screen, press OK</w:t>
+      </w:r>
+    </w:p>
+    <w:p>
+      <w:pPr>
+        <w:pStyle w:val="ListParagraph"/>
+        <w:rPr>
+          <w:lang w:val="en-US"/>
+        </w:rPr>
+      </w:pPr>
+      <w:r>
+        <w:rPr>
+          <w:lang w:val="en-US"/>
+        </w:rPr>
+        <w:drawing>
+          <wp:inline distT="0" distB="0" distL="0" distR="0" wp14:anchorId="0DF6165A" wp14:editId="34C42C13">
+            <wp:extent cx="2225233" cy="1158340"/>
+            <wp:effectExtent l="0" t="0" r="3810" b="3810"/>
+            <wp:docPr id="606756426" name="Picture 1"/>
+            <wp:cNvGraphicFramePr>
+              <a:graphicFrameLocks xmlns:a="http://schemas.openxmlformats.org/drawingml/2006/main" noChangeAspect="1"/>
+            </wp:cNvGraphicFramePr>
+            <a:graphic xmlns:a="http://schemas.openxmlformats.org/drawingml/2006/main">
+              <a:graphicData uri="http://schemas.openxmlformats.org/drawingml/2006/picture">
+                <pic:pic xmlns:pic="http://schemas.openxmlformats.org/drawingml/2006/picture">
+                  <pic:nvPicPr>
+                    <pic:cNvPr id="606756426" name=""/>
+                    <pic:cNvPicPr/>
+                  </pic:nvPicPr>
+                  <pic:blipFill>
+                    <a:blip r:embed="rId14"/>
+                    <a:stretch>
+                      <a:fillRect/>
+                    </a:stretch>
+                  </pic:blipFill>
+                  <pic:spPr>
+                    <a:xfrm>
+                      <a:off x="0" y="0"/>
+                      <a:ext cx="2225233" cy="1158340"/>
+                    </a:xfrm>
+                    <a:prstGeom prst="rect">
+                      <a:avLst/>
+                    </a:prstGeom>
+                  </pic:spPr>
+                </pic:pic>
+              </a:graphicData>
+            </a:graphic>
+          </wp:inline>
+        </w:drawing>
+      </w:r>
+    </w:p>
+    <w:p>
+      <w:pPr>
+        <w:pStyle w:val="ListParagraph"/>
+        <w:numPr>
+          <w:ilvl w:val="0"/>
+          <w:numId w:val="1"/>
+        </w:numPr>
+        <w:rPr>
+          <w:lang w:val="en-US"/>
+        </w:rPr>
+      </w:pPr>
+      <w:r>
+        <w:rPr>
+          <w:lang w:val="en-US"/>
+        </w:rPr>
+        <w:t xml:space="preserve">It asks you to press OK once more  (saving the a_3ME </w:t>
+      </w:r>
+      <w:proofErr w:type="spellStart"/>
+      <w:r>
+        <w:rPr>
+          <w:lang w:val="en-US"/>
+        </w:rPr>
+        <w:t>workfile</w:t>
+      </w:r>
+      <w:proofErr w:type="spellEnd"/>
+      <w:r>
+        <w:rPr>
+          <w:lang w:val="en-US"/>
+        </w:rPr>
+        <w:t xml:space="preserve">). </w:t>
+      </w:r>
+    </w:p>
+    <w:p>
+      <w:pPr>
+        <w:rPr>
+          <w:lang w:val="en-US"/>
+        </w:rPr>
+      </w:pPr>
+    </w:p>
+    <w:p>
+      <w:pPr>
+        <w:rPr>
+          <w:lang w:val="en-US"/>
+        </w:rPr>
+      </w:pPr>
+      <w:r>
+        <w:rPr>
+          <w:lang w:val="en-US"/>
+        </w:rPr>
+        <w:t xml:space="preserve">This creates a new </w:t>
+      </w:r>
+      <w:proofErr w:type="spellStart"/>
+      <w:r>
+        <w:rPr>
+          <w:lang w:val="en-US"/>
+        </w:rPr>
+        <w:t>workfile</w:t>
+      </w:r>
+      <w:proofErr w:type="spellEnd"/>
+      <w:r>
+        <w:rPr>
+          <w:lang w:val="en-US"/>
+        </w:rPr>
+        <w:t xml:space="preserve"> in which the parameters are calibrated for the baseline.</w:t>
+      </w:r>
+    </w:p>
+    <w:p>
+      <w:pPr>
+        <w:rPr>
+          <w:b/>
+          <w:bCs/>
+          <w:lang w:val="en-US"/>
+        </w:rPr>
+      </w:pPr>
+      <w:r>
+        <w:rPr>
+          <w:b/>
+          <w:bCs/>
+          <w:lang w:val="en-US"/>
+        </w:rPr>
+        <w:t xml:space="preserve">Run </w:t>
+      </w:r>
+      <w:r>
+        <w:rPr>
+          <w:b/>
+          <w:bCs/>
+          <w:lang w:val="en-US"/>
+        </w:rPr>
+        <w:t>the baseline scenario</w:t>
+      </w:r>
+    </w:p>
+    <w:p>
+      <w:pPr>
+        <w:pStyle w:val="ListParagraph"/>
+        <w:numPr>
+          <w:ilvl w:val="0"/>
+          <w:numId w:val="1"/>
+        </w:numPr>
+        <w:rPr>
+          <w:lang w:val="en-US"/>
+        </w:rPr>
+      </w:pPr>
+      <w:r>
+        <w:rPr>
+          <w:lang w:val="en-US"/>
+        </w:rPr>
         <w:t>Open f</w:t>
       </w:r>
       <w:r>
         <w:rPr>
           <w:lang w:val="en-US"/>
         </w:rPr>
-        <w:t xml:space="preserve">ile scr/Eviews/run_extra.prg, via File </w:t>
+        <w:t xml:space="preserve">ile </w:t>
+      </w:r>
+      <w:proofErr w:type="spellStart"/>
+      <w:r>
+        <w:rPr>
+          <w:lang w:val="en-US"/>
+        </w:rPr>
+        <w:t>scr</w:t>
+      </w:r>
+      <w:proofErr w:type="spellEnd"/>
+      <w:r>
+        <w:rPr>
+          <w:lang w:val="en-US"/>
+        </w:rPr>
+        <w:t>/</w:t>
+      </w:r>
+      <w:proofErr w:type="spellStart"/>
+      <w:r>
+        <w:rPr>
+          <w:lang w:val="en-US"/>
+        </w:rPr>
+        <w:t>Eviews</w:t>
+      </w:r>
+      <w:proofErr w:type="spellEnd"/>
+      <w:r>
+        <w:rPr>
+          <w:lang w:val="en-US"/>
+        </w:rPr>
+        <w:t>/</w:t>
+      </w:r>
+      <w:proofErr w:type="spellStart"/>
+      <w:r>
+        <w:rPr>
+          <w:lang w:val="en-US"/>
+        </w:rPr>
+        <w:t>run_extra.prg</w:t>
+      </w:r>
+      <w:proofErr w:type="spellEnd"/>
+      <w:r>
+        <w:rPr>
+          <w:lang w:val="en-US"/>
+        </w:rPr>
+        <w:t xml:space="preserve">, via File </w:t>
       </w:r>
       <w:r>
         <w:rPr>
@@ -472,7 +1005,7 @@
                     <pic:cNvPicPr/>
                   </pic:nvPicPr>
                   <pic:blipFill>
-                    <a:blip r:embed="rId11"/>
+                    <a:blip r:embed="rId15"/>
                     <a:stretch>
                       <a:fillRect/>
                     </a:stretch>
@@ -555,7 +1088,7 @@
                     <pic:cNvPicPr/>
                   </pic:nvPicPr>
                   <pic:blipFill>
-                    <a:blip r:embed="rId12"/>
+                    <a:blip r:embed="rId16"/>
                     <a:stretch>
                       <a:fillRect/>
                     </a:stretch>
@@ -587,7 +1120,21 @@
         <w:rPr>
           <w:lang w:val="en-US"/>
         </w:rPr>
-        <w:t xml:space="preserve">Note that the sheets ‘prices_1’, ‘shadowprice_1’ etc are not uploaded (they are only included as a comment).   </w:t>
+        <w:t xml:space="preserve">Note that the sheets ‘prices_1’, ‘shadowprice_1’ </w:t>
+      </w:r>
+      <w:proofErr w:type="spellStart"/>
+      <w:r>
+        <w:rPr>
+          <w:lang w:val="en-US"/>
+        </w:rPr>
+        <w:t>etc</w:t>
+      </w:r>
+      <w:proofErr w:type="spellEnd"/>
+      <w:r>
+        <w:rPr>
+          <w:lang w:val="en-US"/>
+        </w:rPr>
+        <w:t xml:space="preserve"> are not uploaded (they are only included as a comment).   </w:t>
       </w:r>
     </w:p>
     <w:p>
@@ -624,7 +1171,21 @@
           <w:lang w:val="en-US"/>
         </w:rPr>
         <w:lastRenderedPageBreak/>
-        <w:t xml:space="preserve">Make sure you save any changes to run_extra.prg before running the model. </w:t>
+        <w:t xml:space="preserve">Make sure you save any changes to </w:t>
+      </w:r>
+      <w:proofErr w:type="spellStart"/>
+      <w:r>
+        <w:rPr>
+          <w:lang w:val="en-US"/>
+        </w:rPr>
+        <w:t>run_extra.prg</w:t>
+      </w:r>
+      <w:proofErr w:type="spellEnd"/>
+      <w:r>
+        <w:rPr>
+          <w:lang w:val="en-US"/>
+        </w:rPr>
+        <w:t xml:space="preserve"> before running the model. </w:t>
       </w:r>
     </w:p>
     <w:p>
@@ -642,7 +1203,21 @@
         <w:rPr>
           <w:lang w:val="en-US"/>
         </w:rPr>
-        <w:t xml:space="preserve">Run the model by going back to the file ‘main.prg’. Make sure that – this time – the line </w:t>
+        <w:t>Run the model by going back to the file ‘</w:t>
+      </w:r>
+      <w:proofErr w:type="spellStart"/>
+      <w:r>
+        <w:rPr>
+          <w:lang w:val="en-US"/>
+        </w:rPr>
+        <w:t>main.prg</w:t>
+      </w:r>
+      <w:proofErr w:type="spellEnd"/>
+      <w:r>
+        <w:rPr>
+          <w:lang w:val="en-US"/>
+        </w:rPr>
+        <w:t xml:space="preserve">’. Make sure that – this time – the line </w:t>
       </w:r>
       <w:r>
         <w:rPr>
@@ -650,12 +1225,14 @@
         </w:rPr>
         <w:t>call run("</w:t>
       </w:r>
+      <w:proofErr w:type="spellStart"/>
       <w:r>
         <w:rPr>
           <w:lang w:val="en-US"/>
         </w:rPr>
         <w:t>workfile</w:t>
       </w:r>
+      <w:proofErr w:type="spellEnd"/>
       <w:r>
         <w:rPr>
           <w:lang w:val="en-US"/>
@@ -716,7 +1293,7 @@
                     <pic:cNvPicPr/>
                   </pic:nvPicPr>
                   <pic:blipFill>
-                    <a:blip r:embed="rId13"/>
+                    <a:blip r:embed="rId17"/>
                     <a:stretch>
                       <a:fillRect/>
                     </a:stretch>
@@ -761,20 +1338,69 @@
         <w:rPr>
           <w:lang w:val="en-US"/>
         </w:rPr>
-        <w:t xml:space="preserve">Run main.prg by pressing run in the upper left corner. </w:t>
-      </w:r>
-    </w:p>
-    <w:p>
-      <w:pPr>
-        <w:rPr>
-          <w:lang w:val="en-US"/>
-        </w:rPr>
-      </w:pPr>
-      <w:r>
-        <w:rPr>
-          <w:lang w:val="en-US"/>
-        </w:rPr>
-        <w:t xml:space="preserve">This creates workfile that makes use of the calibrated workfile. All the variables that belong to the scenario are given with _2, all variables that belong to the calibrated baseline are indicated with _0. </w:t>
+        <w:t xml:space="preserve">Run </w:t>
+      </w:r>
+      <w:proofErr w:type="spellStart"/>
+      <w:r>
+        <w:rPr>
+          <w:lang w:val="en-US"/>
+        </w:rPr>
+        <w:t>main.prg</w:t>
+      </w:r>
+      <w:proofErr w:type="spellEnd"/>
+      <w:r>
+        <w:rPr>
+          <w:lang w:val="en-US"/>
+        </w:rPr>
+        <w:t xml:space="preserve"> by pressing run in the upper left corner. </w:t>
+      </w:r>
+      <w:r>
+        <w:rPr>
+          <w:lang w:val="en-US"/>
+        </w:rPr>
+        <w:br/>
+        <w:t xml:space="preserve">And again press OK, everywhere where you also pressed OK in the last run. </w:t>
+      </w:r>
+    </w:p>
+    <w:p>
+      <w:pPr>
+        <w:rPr>
+          <w:lang w:val="en-US"/>
+        </w:rPr>
+      </w:pPr>
+      <w:r>
+        <w:rPr>
+          <w:lang w:val="en-US"/>
+        </w:rPr>
+        <w:t xml:space="preserve">This creates </w:t>
+      </w:r>
+      <w:proofErr w:type="spellStart"/>
+      <w:r>
+        <w:rPr>
+          <w:lang w:val="en-US"/>
+        </w:rPr>
+        <w:t>workfile</w:t>
+      </w:r>
+      <w:proofErr w:type="spellEnd"/>
+      <w:r>
+        <w:rPr>
+          <w:lang w:val="en-US"/>
+        </w:rPr>
+        <w:t xml:space="preserve"> that makes use of the calibrated </w:t>
+      </w:r>
+      <w:proofErr w:type="spellStart"/>
+      <w:r>
+        <w:rPr>
+          <w:lang w:val="en-US"/>
+        </w:rPr>
+        <w:t>workfile</w:t>
+      </w:r>
+      <w:proofErr w:type="spellEnd"/>
+      <w:r>
+        <w:rPr>
+          <w:lang w:val="en-US"/>
+        </w:rPr>
+        <w:t xml:space="preserve">. All the variables that belong to the scenario are given with _2, all variables that belong to the calibrated baseline are indicated with _0. </w:t>
       </w:r>
     </w:p>
     <w:p>
@@ -822,7 +1448,21 @@
         <w:rPr>
           <w:lang w:val="en-US"/>
         </w:rPr>
-        <w:t xml:space="preserve">The paper presents one baseline scenario and 3 price scenarios. All four scenarios can be run under the label scenario_name = baseline. (The naming here might be confusing.) However, we will change the excel sheets that are imported for the scenario. </w:t>
+        <w:t xml:space="preserve">The paper presents one baseline scenario and 3 price scenarios. All four scenarios can be run under the label </w:t>
+      </w:r>
+      <w:proofErr w:type="spellStart"/>
+      <w:r>
+        <w:rPr>
+          <w:lang w:val="en-US"/>
+        </w:rPr>
+        <w:t>scenario_name</w:t>
+      </w:r>
+      <w:proofErr w:type="spellEnd"/>
+      <w:r>
+        <w:rPr>
+          <w:lang w:val="en-US"/>
+        </w:rPr>
+        <w:t xml:space="preserve"> = baseline. (The naming here might be confusing.) However, we will change the excel sheets that are imported for the scenario. </w:t>
       </w:r>
     </w:p>
     <w:p>
@@ -840,7 +1480,49 @@
         <w:rPr>
           <w:lang w:val="en-US"/>
         </w:rPr>
-        <w:t xml:space="preserve">For running price scenario 1, adjust the code under scr/Eviews/run_extra.prg as follows: </w:t>
+        <w:t xml:space="preserve">For running price scenario 1, adjust the code under </w:t>
+      </w:r>
+      <w:proofErr w:type="spellStart"/>
+      <w:r>
+        <w:rPr>
+          <w:lang w:val="en-US"/>
+        </w:rPr>
+        <w:t>scr</w:t>
+      </w:r>
+      <w:proofErr w:type="spellEnd"/>
+      <w:r>
+        <w:rPr>
+          <w:lang w:val="en-US"/>
+        </w:rPr>
+        <w:t>/</w:t>
+      </w:r>
+      <w:proofErr w:type="spellStart"/>
+      <w:r>
+        <w:rPr>
+          <w:lang w:val="en-US"/>
+        </w:rPr>
+        <w:t>Eviews</w:t>
+      </w:r>
+      <w:proofErr w:type="spellEnd"/>
+      <w:r>
+        <w:rPr>
+          <w:lang w:val="en-US"/>
+        </w:rPr>
+        <w:t>/</w:t>
+      </w:r>
+      <w:proofErr w:type="spellStart"/>
+      <w:r>
+        <w:rPr>
+          <w:lang w:val="en-US"/>
+        </w:rPr>
+        <w:t>run_extra.prg</w:t>
+      </w:r>
+      <w:proofErr w:type="spellEnd"/>
+      <w:r>
+        <w:rPr>
+          <w:lang w:val="en-US"/>
+        </w:rPr>
+        <w:t xml:space="preserve"> as follows: </w:t>
       </w:r>
       <w:r>
         <w:rPr>
@@ -869,7 +1551,7 @@
                     <pic:cNvPicPr/>
                   </pic:nvPicPr>
                   <pic:blipFill>
-                    <a:blip r:embed="rId14"/>
+                    <a:blip r:embed="rId18"/>
                     <a:stretch>
                       <a:fillRect/>
                     </a:stretch>
@@ -923,8 +1605,16 @@
         <w:rPr>
           <w:lang w:val="en-US"/>
         </w:rPr>
-        <w:t>Run the scenario via pressing run in main.prg</w:t>
-      </w:r>
+        <w:t xml:space="preserve">Run the scenario via pressing run in </w:t>
+      </w:r>
+      <w:proofErr w:type="spellStart"/>
+      <w:r>
+        <w:rPr>
+          <w:lang w:val="en-US"/>
+        </w:rPr>
+        <w:t>main.prg</w:t>
+      </w:r>
+      <w:proofErr w:type="spellEnd"/>
     </w:p>
     <w:p>
       <w:pPr>
@@ -1090,7 +1780,22 @@
         <w:rPr>
           <w:lang w:val="en-US"/>
         </w:rPr>
-        <w:t xml:space="preserve">Baseline scenario: copy-paste the whole sheet with results in sheet Baseline_raw. </w:t>
+        <w:lastRenderedPageBreak/>
+        <w:t xml:space="preserve">Baseline scenario: copy-paste the whole sheet with results in sheet </w:t>
+      </w:r>
+      <w:proofErr w:type="spellStart"/>
+      <w:r>
+        <w:rPr>
+          <w:lang w:val="en-US"/>
+        </w:rPr>
+        <w:t>Baseline_raw</w:t>
+      </w:r>
+      <w:proofErr w:type="spellEnd"/>
+      <w:r>
+        <w:rPr>
+          <w:lang w:val="en-US"/>
+        </w:rPr>
+        <w:t xml:space="preserve">. </w:t>
       </w:r>
     </w:p>
     <w:p>
@@ -1108,7 +1813,6 @@
         <w:rPr>
           <w:lang w:val="en-US"/>
         </w:rPr>
-        <w:lastRenderedPageBreak/>
         <w:t xml:space="preserve">Price scenario 1: </w:t>
       </w:r>
       <w:r>
@@ -3426,6 +4130,102 @@
 </file>
 
 <file path=customXml/item2.xml><?xml version="1.0" encoding="utf-8"?>
+<?mso-contentType ?>
+<spe:Receivers xmlns:spe="http://schemas.microsoft.com/sharepoint/events">
+  <Receiver>
+    <Name>Document ID Generator</Name>
+    <Synchronization>Synchronous</Synchronization>
+    <Type>10001</Type>
+    <SequenceNumber>1000</SequenceNumber>
+    <Url/>
+    <Assembly>Microsoft.Office.DocumentManagement, Version=16.0.0.0, Culture=neutral, PublicKeyToken=71e9bce111e9429c</Assembly>
+    <Class>Microsoft.Office.DocumentManagement.Internal.DocIdHandler</Class>
+    <Data/>
+    <Filter/>
+  </Receiver>
+  <Receiver>
+    <Name>Document ID Generator</Name>
+    <Synchronization>Synchronous</Synchronization>
+    <Type>10002</Type>
+    <SequenceNumber>1001</SequenceNumber>
+    <Url/>
+    <Assembly>Microsoft.Office.DocumentManagement, Version=16.0.0.0, Culture=neutral, PublicKeyToken=71e9bce111e9429c</Assembly>
+    <Class>Microsoft.Office.DocumentManagement.Internal.DocIdHandler</Class>
+    <Data/>
+    <Filter/>
+  </Receiver>
+  <Receiver>
+    <Name>Document ID Generator</Name>
+    <Synchronization>Synchronous</Synchronization>
+    <Type>10004</Type>
+    <SequenceNumber>1002</SequenceNumber>
+    <Url/>
+    <Assembly>Microsoft.Office.DocumentManagement, Version=16.0.0.0, Culture=neutral, PublicKeyToken=71e9bce111e9429c</Assembly>
+    <Class>Microsoft.Office.DocumentManagement.Internal.DocIdHandler</Class>
+    <Data/>
+    <Filter/>
+  </Receiver>
+  <Receiver>
+    <Name>Document ID Generator</Name>
+    <Synchronization>Synchronous</Synchronization>
+    <Type>10006</Type>
+    <SequenceNumber>1003</SequenceNumber>
+    <Url/>
+    <Assembly>Microsoft.Office.DocumentManagement, Version=16.0.0.0, Culture=neutral, PublicKeyToken=71e9bce111e9429c</Assembly>
+    <Class>Microsoft.Office.DocumentManagement.Internal.DocIdHandler</Class>
+    <Data/>
+    <Filter/>
+  </Receiver>
+</spe:Receivers>
+</file>
+
+<file path=customXml/item3.xml><?xml version="1.0" encoding="utf-8"?>
+<p:properties xmlns:p="http://schemas.microsoft.com/office/2006/metadata/properties" xmlns:xsi="http://www.w3.org/2001/XMLSchema-instance" xmlns:pc="http://schemas.microsoft.com/office/infopath/2007/PartnerControls">
+  <documentManagement>
+    <TNOC_ClusterName xmlns="2f6a910d-138e-42c1-8e8a-320c1b7cf3f7">KIP 2022 Exploring the macro-economic</TNOC_ClusterName>
+    <n2a7a23bcc2241cb9261f9a914c7c1bb xmlns="c463f51e-4dec-4a9c-9d0f-3527336f327b">
+      <Terms xmlns="http://schemas.microsoft.com/office/infopath/2007/PartnerControls">
+        <TermInfo xmlns="http://schemas.microsoft.com/office/infopath/2007/PartnerControls">
+          <TermName xmlns="http://schemas.microsoft.com/office/infopath/2007/PartnerControls">TNO Internal</TermName>
+          <TermId xmlns="http://schemas.microsoft.com/office/infopath/2007/PartnerControls">1a23c89f-ef54-4907-86fd-8242403ff722</TermId>
+        </TermInfo>
+      </Terms>
+    </n2a7a23bcc2241cb9261f9a914c7c1bb>
+    <TNOC_ClusterId xmlns="2f6a910d-138e-42c1-8e8a-320c1b7cf3f7">060.51637</TNOC_ClusterId>
+    <cf581d8792c646118aad2c2c4ecdfa8c xmlns="c463f51e-4dec-4a9c-9d0f-3527336f327b">
+      <Terms xmlns="http://schemas.microsoft.com/office/infopath/2007/PartnerControls"/>
+    </cf581d8792c646118aad2c2c4ecdfa8c>
+    <lcf76f155ced4ddcb4097134ff3c332f xmlns="1c0a0543-f898-4216-b5b3-85b5b42fc6f2">
+      <Terms xmlns="http://schemas.microsoft.com/office/infopath/2007/PartnerControls"/>
+    </lcf76f155ced4ddcb4097134ff3c332f>
+    <lca20d149a844688b6abf34073d5c21d xmlns="c463f51e-4dec-4a9c-9d0f-3527336f327b">
+      <Terms xmlns="http://schemas.microsoft.com/office/infopath/2007/PartnerControls"/>
+    </lca20d149a844688b6abf34073d5c21d>
+    <TaxCatchAll xmlns="c463f51e-4dec-4a9c-9d0f-3527336f327b">
+      <Value>5</Value>
+      <Value>1</Value>
+    </TaxCatchAll>
+    <bac4ab11065f4f6c809c820c57e320e5 xmlns="c463f51e-4dec-4a9c-9d0f-3527336f327b">
+      <Terms xmlns="http://schemas.microsoft.com/office/infopath/2007/PartnerControls"/>
+    </bac4ab11065f4f6c809c820c57e320e5>
+    <h15fbb78f4cb41d290e72f301ea2865f xmlns="c463f51e-4dec-4a9c-9d0f-3527336f327b">
+      <Terms xmlns="http://schemas.microsoft.com/office/infopath/2007/PartnerControls">
+        <TermInfo xmlns="http://schemas.microsoft.com/office/infopath/2007/PartnerControls">
+          <TermName xmlns="http://schemas.microsoft.com/office/infopath/2007/PartnerControls">Project</TermName>
+          <TermId xmlns="http://schemas.microsoft.com/office/infopath/2007/PartnerControls">fa11c4c9-105f-402c-bb40-9a56b4989397</TermId>
+        </TermInfo>
+      </Terms>
+    </h15fbb78f4cb41d290e72f301ea2865f>
+    <_dlc_DocId xmlns="c463f51e-4dec-4a9c-9d0f-3527336f327b">QVQ5D6UYX565-1821469542-810</_dlc_DocId>
+    <_dlc_DocIdUrl xmlns="c463f51e-4dec-4a9c-9d0f-3527336f327b">
+      <Url>https://365tno.sharepoint.com/teams/P060.51637/_layouts/15/DocIdRedir.aspx?ID=QVQ5D6UYX565-1821469542-810</Url>
+      <Description>QVQ5D6UYX565-1821469542-810</Description>
+    </_dlc_DocIdUrl>
+  </documentManagement>
+</p:properties>
+</file>
+
+<file path=customXml/item4.xml><?xml version="1.0" encoding="utf-8"?>
 <ct:contentTypeSchema xmlns:ct="http://schemas.microsoft.com/office/2006/metadata/contentType" xmlns:ma="http://schemas.microsoft.com/office/2006/metadata/properties/metaAttributes" ct:_="" ma:_="" ma:contentTypeName="Team Document" ma:contentTypeID="0x010100A35317DCC28344A7B82488658A034A5C0100FB707EEC1EA8C64F95929925D879C502" ma:contentTypeVersion="14" ma:contentTypeDescription=" " ma:contentTypeScope="" ma:versionID="fcaf3bc967938c03b13ae3a47ef417f6">
   <xsd:schema xmlns:xsd="http://www.w3.org/2001/XMLSchema" xmlns:xs="http://www.w3.org/2001/XMLSchema" xmlns:p="http://schemas.microsoft.com/office/2006/metadata/properties" xmlns:ns2="c463f51e-4dec-4a9c-9d0f-3527336f327b" xmlns:ns3="2f6a910d-138e-42c1-8e8a-320c1b7cf3f7" xmlns:ns5="1c0a0543-f898-4216-b5b3-85b5b42fc6f2" targetNamespace="http://schemas.microsoft.com/office/2006/metadata/properties" ma:root="true" ma:fieldsID="1f9120e319e56c099e7e0727247b6e8d" ns2:_="" ns3:_="" ns5:_="">
     <xsd:import namespace="c463f51e-4dec-4a9c-9d0f-3527336f327b"/>
@@ -3738,102 +4538,6 @@
 </ct:contentTypeSchema>
 </file>
 
-<file path=customXml/item3.xml><?xml version="1.0" encoding="utf-8"?>
-<p:properties xmlns:p="http://schemas.microsoft.com/office/2006/metadata/properties" xmlns:xsi="http://www.w3.org/2001/XMLSchema-instance" xmlns:pc="http://schemas.microsoft.com/office/infopath/2007/PartnerControls">
-  <documentManagement>
-    <TNOC_ClusterName xmlns="2f6a910d-138e-42c1-8e8a-320c1b7cf3f7">KIP 2022 Exploring the macro-economic</TNOC_ClusterName>
-    <n2a7a23bcc2241cb9261f9a914c7c1bb xmlns="c463f51e-4dec-4a9c-9d0f-3527336f327b">
-      <Terms xmlns="http://schemas.microsoft.com/office/infopath/2007/PartnerControls">
-        <TermInfo xmlns="http://schemas.microsoft.com/office/infopath/2007/PartnerControls">
-          <TermName xmlns="http://schemas.microsoft.com/office/infopath/2007/PartnerControls">TNO Internal</TermName>
-          <TermId xmlns="http://schemas.microsoft.com/office/infopath/2007/PartnerControls">1a23c89f-ef54-4907-86fd-8242403ff722</TermId>
-        </TermInfo>
-      </Terms>
-    </n2a7a23bcc2241cb9261f9a914c7c1bb>
-    <TNOC_ClusterId xmlns="2f6a910d-138e-42c1-8e8a-320c1b7cf3f7">060.51637</TNOC_ClusterId>
-    <cf581d8792c646118aad2c2c4ecdfa8c xmlns="c463f51e-4dec-4a9c-9d0f-3527336f327b">
-      <Terms xmlns="http://schemas.microsoft.com/office/infopath/2007/PartnerControls"/>
-    </cf581d8792c646118aad2c2c4ecdfa8c>
-    <lcf76f155ced4ddcb4097134ff3c332f xmlns="1c0a0543-f898-4216-b5b3-85b5b42fc6f2">
-      <Terms xmlns="http://schemas.microsoft.com/office/infopath/2007/PartnerControls"/>
-    </lcf76f155ced4ddcb4097134ff3c332f>
-    <lca20d149a844688b6abf34073d5c21d xmlns="c463f51e-4dec-4a9c-9d0f-3527336f327b">
-      <Terms xmlns="http://schemas.microsoft.com/office/infopath/2007/PartnerControls"/>
-    </lca20d149a844688b6abf34073d5c21d>
-    <TaxCatchAll xmlns="c463f51e-4dec-4a9c-9d0f-3527336f327b">
-      <Value>5</Value>
-      <Value>1</Value>
-    </TaxCatchAll>
-    <bac4ab11065f4f6c809c820c57e320e5 xmlns="c463f51e-4dec-4a9c-9d0f-3527336f327b">
-      <Terms xmlns="http://schemas.microsoft.com/office/infopath/2007/PartnerControls"/>
-    </bac4ab11065f4f6c809c820c57e320e5>
-    <h15fbb78f4cb41d290e72f301ea2865f xmlns="c463f51e-4dec-4a9c-9d0f-3527336f327b">
-      <Terms xmlns="http://schemas.microsoft.com/office/infopath/2007/PartnerControls">
-        <TermInfo xmlns="http://schemas.microsoft.com/office/infopath/2007/PartnerControls">
-          <TermName xmlns="http://schemas.microsoft.com/office/infopath/2007/PartnerControls">Project</TermName>
-          <TermId xmlns="http://schemas.microsoft.com/office/infopath/2007/PartnerControls">fa11c4c9-105f-402c-bb40-9a56b4989397</TermId>
-        </TermInfo>
-      </Terms>
-    </h15fbb78f4cb41d290e72f301ea2865f>
-    <_dlc_DocId xmlns="c463f51e-4dec-4a9c-9d0f-3527336f327b">QVQ5D6UYX565-1821469542-810</_dlc_DocId>
-    <_dlc_DocIdUrl xmlns="c463f51e-4dec-4a9c-9d0f-3527336f327b">
-      <Url>https://365tno.sharepoint.com/teams/P060.51637/_layouts/15/DocIdRedir.aspx?ID=QVQ5D6UYX565-1821469542-810</Url>
-      <Description>QVQ5D6UYX565-1821469542-810</Description>
-    </_dlc_DocIdUrl>
-  </documentManagement>
-</p:properties>
-</file>
-
-<file path=customXml/item4.xml><?xml version="1.0" encoding="utf-8"?>
-<?mso-contentType ?>
-<spe:Receivers xmlns:spe="http://schemas.microsoft.com/sharepoint/events">
-  <Receiver>
-    <Name>Document ID Generator</Name>
-    <Synchronization>Synchronous</Synchronization>
-    <Type>10001</Type>
-    <SequenceNumber>1000</SequenceNumber>
-    <Url/>
-    <Assembly>Microsoft.Office.DocumentManagement, Version=16.0.0.0, Culture=neutral, PublicKeyToken=71e9bce111e9429c</Assembly>
-    <Class>Microsoft.Office.DocumentManagement.Internal.DocIdHandler</Class>
-    <Data/>
-    <Filter/>
-  </Receiver>
-  <Receiver>
-    <Name>Document ID Generator</Name>
-    <Synchronization>Synchronous</Synchronization>
-    <Type>10002</Type>
-    <SequenceNumber>1001</SequenceNumber>
-    <Url/>
-    <Assembly>Microsoft.Office.DocumentManagement, Version=16.0.0.0, Culture=neutral, PublicKeyToken=71e9bce111e9429c</Assembly>
-    <Class>Microsoft.Office.DocumentManagement.Internal.DocIdHandler</Class>
-    <Data/>
-    <Filter/>
-  </Receiver>
-  <Receiver>
-    <Name>Document ID Generator</Name>
-    <Synchronization>Synchronous</Synchronization>
-    <Type>10004</Type>
-    <SequenceNumber>1002</SequenceNumber>
-    <Url/>
-    <Assembly>Microsoft.Office.DocumentManagement, Version=16.0.0.0, Culture=neutral, PublicKeyToken=71e9bce111e9429c</Assembly>
-    <Class>Microsoft.Office.DocumentManagement.Internal.DocIdHandler</Class>
-    <Data/>
-    <Filter/>
-  </Receiver>
-  <Receiver>
-    <Name>Document ID Generator</Name>
-    <Synchronization>Synchronous</Synchronization>
-    <Type>10006</Type>
-    <SequenceNumber>1003</SequenceNumber>
-    <Url/>
-    <Assembly>Microsoft.Office.DocumentManagement, Version=16.0.0.0, Culture=neutral, PublicKeyToken=71e9bce111e9429c</Assembly>
-    <Class>Microsoft.Office.DocumentManagement.Internal.DocIdHandler</Class>
-    <Data/>
-    <Filter/>
-  </Receiver>
-</spe:Receivers>
-</file>
-
 <file path=customXml/itemProps1.xml><?xml version="1.0" encoding="utf-8"?>
 <ds:datastoreItem xmlns:ds="http://schemas.openxmlformats.org/officeDocument/2006/customXml" ds:itemID="{436FFD75-E26C-4621-B387-BD8D30703D90}">
   <ds:schemaRefs>
@@ -3843,6 +4547,26 @@
 </file>
 
 <file path=customXml/itemProps2.xml><?xml version="1.0" encoding="utf-8"?>
+<ds:datastoreItem xmlns:ds="http://schemas.openxmlformats.org/officeDocument/2006/customXml" ds:itemID="{BCB2C537-DE51-49E5-9B98-714FD3F82AA2}">
+  <ds:schemaRefs>
+    <ds:schemaRef ds:uri="http://schemas.microsoft.com/sharepoint/events"/>
+  </ds:schemaRefs>
+</ds:datastoreItem>
+</file>
+
+<file path=customXml/itemProps3.xml><?xml version="1.0" encoding="utf-8"?>
+<ds:datastoreItem xmlns:ds="http://schemas.openxmlformats.org/officeDocument/2006/customXml" ds:itemID="{23FB51A9-31CB-453C-88AD-A8B7359DD29F}">
+  <ds:schemaRefs>
+    <ds:schemaRef ds:uri="http://schemas.microsoft.com/office/2006/metadata/properties"/>
+    <ds:schemaRef ds:uri="http://schemas.microsoft.com/office/infopath/2007/PartnerControls"/>
+    <ds:schemaRef ds:uri="2f6a910d-138e-42c1-8e8a-320c1b7cf3f7"/>
+    <ds:schemaRef ds:uri="c463f51e-4dec-4a9c-9d0f-3527336f327b"/>
+    <ds:schemaRef ds:uri="1c0a0543-f898-4216-b5b3-85b5b42fc6f2"/>
+  </ds:schemaRefs>
+</ds:datastoreItem>
+</file>
+
+<file path=customXml/itemProps4.xml><?xml version="1.0" encoding="utf-8"?>
 <ds:datastoreItem xmlns:ds="http://schemas.openxmlformats.org/officeDocument/2006/customXml" ds:itemID="{CBED39DF-A893-4D9D-96C8-97723B33C8A0}">
   <ds:schemaRefs>
     <ds:schemaRef ds:uri="http://schemas.microsoft.com/office/2006/metadata/contentType"/>
@@ -3860,24 +4584,4 @@
     <ds:schemaRef ds:uri="http://schemas.microsoft.com/internal/obd"/>
   </ds:schemaRefs>
 </ds:datastoreItem>
-</file>
-
-<file path=customXml/itemProps3.xml><?xml version="1.0" encoding="utf-8"?>
-<ds:datastoreItem xmlns:ds="http://schemas.openxmlformats.org/officeDocument/2006/customXml" ds:itemID="{23FB51A9-31CB-453C-88AD-A8B7359DD29F}">
-  <ds:schemaRefs>
-    <ds:schemaRef ds:uri="http://schemas.microsoft.com/office/2006/metadata/properties"/>
-    <ds:schemaRef ds:uri="http://schemas.microsoft.com/office/infopath/2007/PartnerControls"/>
-    <ds:schemaRef ds:uri="2f6a910d-138e-42c1-8e8a-320c1b7cf3f7"/>
-    <ds:schemaRef ds:uri="c463f51e-4dec-4a9c-9d0f-3527336f327b"/>
-    <ds:schemaRef ds:uri="1c0a0543-f898-4216-b5b3-85b5b42fc6f2"/>
-  </ds:schemaRefs>
-</ds:datastoreItem>
-</file>
-
-<file path=customXml/itemProps4.xml><?xml version="1.0" encoding="utf-8"?>
-<ds:datastoreItem xmlns:ds="http://schemas.openxmlformats.org/officeDocument/2006/customXml" ds:itemID="{BCB2C537-DE51-49E5-9B98-714FD3F82AA2}">
-  <ds:schemaRefs>
-    <ds:schemaRef ds:uri="http://schemas.microsoft.com/sharepoint/events"/>
-  </ds:schemaRefs>
-</ds:datastoreItem>
 </file>
</xml_diff>